<commit_message>
Update the support manual documentation
Replit-Commit-Author: Agent
</commit_message>
<xml_diff>
--- a/output/Support_Manual.docx
+++ b/output/Support_Manual.docx
@@ -1,6 +1,6 @@
 
 <file path=word/document.xml><?xml version="1.0" encoding="utf-8"?>
-<w:document xmlns:w="http://schemas.openxmlformats.org/wordprocessingml/2006/main" xmlns:m="http://schemas.openxmlformats.org/officeDocument/2006/math" xmlns:r="http://schemas.openxmlformats.org/officeDocument/2006/relationships" xmlns:o="urn:schemas-microsoft-com:office:office" xmlns:v="urn:schemas-microsoft-com:vml" xmlns:w10="urn:schemas-microsoft-com:office:word" xmlns:a="http://schemas.openxmlformats.org/drawingml/2006/main" xmlns:pic="http://schemas.openxmlformats.org/drawingml/2006/picture" xmlns:wp="http://schemas.openxmlformats.org/drawingml/2006/wordprocessingDrawing">
+<w:document xmlns:w="http://schemas.openxmlformats.org/wordprocessingml/2006/main">
   <w:body>
     <w:p>
       <w:pPr>
@@ -12,10 +12,10 @@
     </w:p>
     <w:p>
       <w:pPr>
-        <w:pStyle w:val="FirstParagraph"/>
+        <w:pStyle w:val="BodyText"/>
       </w:pPr>
       <w:r>
-        <w:t xml:space="preserve">We’ve built an app together and I moved it to my own domain, which is live now. The frontend address (handled by Vercel): https://budger.app — the backend address (handled by Render): https://budger.onrender.com</w:t>
+        <w:t xml:space="preserve">We've built an app together and I moved it to my own domain, which is live now. The frontend address (handled by Vercel): https://budger.app — the backend address (handled by Render): https://budger.onrender.com</w:t>
       </w:r>
     </w:p>
     <w:p>
@@ -31,7 +31,7 @@
         <w:pStyle w:val="BodyText"/>
       </w:pPr>
       <w:r>
-        <w:t xml:space="preserve">GitHub is connected with a token — ask me right away to add it as a secret if it isn’t already provided. DB is handled by Neon.tech — same, ask me immediately if the secret isn’t already there.</w:t>
+        <w:t xml:space="preserve">GitHub is connected with a token — ask me right away to add it as a secret if it isn't already provided. DB is handled by Neon.tech — same, ask me immediately if the secret isn't already there.</w:t>
       </w:r>
     </w:p>
     <w:p>
@@ -39,7 +39,7 @@
         <w:pStyle w:val="BodyText"/>
       </w:pPr>
       <w:r>
-        <w:t xml:space="preserve">I want you to be my supreme app support and software house combined. When I tell you what is wrong or what to correct, you jump in, make the corrections, and push to GitHub. You don’t need to trigger deploys on Vercel or Render — just tell me when the files are pushed to GitHub and I’ll confirm the deploy from there.</w:t>
+        <w:t xml:space="preserve">I want you to be my supreme app support and software house combined. When I tell you what is wrong or what to correct, you jump in, make the corrections, and push to GitHub. You must not trigger deploys on Vercel or Render — just tell me when the files are pushed to GitHub and I'll deploy manually from there.</w:t>
       </w:r>
     </w:p>
     <w:p>
@@ -47,7 +47,15 @@
         <w:pStyle w:val="BodyText"/>
       </w:pPr>
       <w:r>
-        <w:t xml:space="preserve">Ground rule — where fixes live: Every fix must be made directly in export/frontend/ or export/backend/— not in artifacts/. The artifacts/ workspace is for local dev/testing only. If a fix also needs to be previewed locally, apply it in both places — but export/ is what ships.</w:t>
+        <w:t xml:space="preserve">Ground rule — where fixes live: Every fix must be made directly in export/frontend/ or export/backend/ — not in artifacts/. The artifacts/ workspace is for local dev/testing only. If a fix also needs to be previewed locally, apply it in both places — but export/ is what ships.</w:t>
+      </w:r>
+    </w:p>
+    <w:p>
+      <w:pPr>
+        <w:pStyle w:val="BodyText"/>
+      </w:pPr>
+      <w:r>
+        <w:t xml:space="preserve">Another ground rule: do not ask me to switch to Power or Master models. I'd always consciously choose to stay on Free models and there is. I need for you to waste time asking me to change.</w:t>
       </w:r>
     </w:p>
     <w:p>

</xml_diff>